<commit_message>
docs(ecad): document unpacked OH_Symbols library and KiCad 10 setup
Add Windows migration and verification instructions, update shared-library
mapping and preflight checks, replace older KiCad version requirements,
and include the corresponding wiki update patch for application after merge.
</commit_message>
<xml_diff>
--- a/ECAD/docs/Generating_ECAD_Manufacturing_Files-V0.1.docx
+++ b/ECAD/docs/Generating_ECAD_Manufacturing_Files-V0.1.docx
@@ -34,15 +34,11 @@
     <w:p>
       <w:proofErr w:type="spellStart"/>
       <w:r>
-        <w:t>KiCAD</w:t>
+        <w:t>KiCad 10 (screenshots are historical)</w:t>
       </w:r>
       <w:proofErr w:type="spellEnd"/>
-      <w:r>
-        <w:t xml:space="preserve"> 5.1.</w:t>
-      </w:r>
-      <w:r>
-        <w:t>0 or above</w:t>
-      </w:r>
+      <w:r/>
+      <w:r/>
     </w:p>
     <w:p/>
     <w:p>

</xml_diff>